<commit_message>
Actualizar cuaderno y Paso 3 con los datos del informe de Luna de Cristal
Co-Authored-By: Claude Opus 5.5 <noreply@anthropic.com>
Claude-Session: https://claude.ai/code/session_01P9bj8o7UcwbCu86Zsog7Lb
</commit_message>
<xml_diff>
--- a/Actividad Alva instructora Luna de Cristal/1_CUADERNO_Lo_que_va_a_mano.docx
+++ b/Actividad Alva instructora Luna de Cristal/1_CUADERNO_Lo_que_va_a_mano.docx
@@ -4,7 +4,7 @@
   <w:body>
     <w:p>
       <w:pPr>
-        <w:spacing w:before="2400"/>
+        <w:spacing w:before="1800"/>
       </w:pPr>
     </w:p>
     <w:p>
@@ -28,13 +28,8 @@
         <w:jc w:val="center"/>
       </w:pPr>
       <w:r>
-        <w:t xml:space="preserve">[Nombre del programa de formación] – Ficha [número]</w:t>
-      </w:r>
-    </w:p>
-    <w:p>
-      <w:pPr>
-        <w:spacing w:before="800"/>
-      </w:pPr>
+        <w:t xml:space="preserve">Tecnólogo en Gestión del Desarrollo Administrativo e Innovación</w:t>
+      </w:r>
     </w:p>
     <w:p>
       <w:pPr>
@@ -42,6 +37,20 @@
         <w:jc w:val="center"/>
       </w:pPr>
       <w:r>
+        <w:t xml:space="preserve">Ficha [número]</w:t>
+      </w:r>
+    </w:p>
+    <w:p>
+      <w:pPr>
+        <w:spacing w:before="700"/>
+      </w:pPr>
+    </w:p>
+    <w:p>
+      <w:pPr>
+        <w:spacing w:after="120" w:line="300"/>
+        <w:jc w:val="center"/>
+      </w:pPr>
+      <w:r>
         <w:rPr>
           <w:b/>
           <w:bCs/>
@@ -81,7 +90,7 @@
     </w:p>
     <w:p>
       <w:pPr>
-        <w:spacing w:before="1000"/>
+        <w:spacing w:before="900"/>
       </w:pPr>
     </w:p>
     <w:p>
@@ -90,7 +99,7 @@
         <w:jc w:val="center"/>
       </w:pPr>
       <w:r>
-        <w:t xml:space="preserve">Aprendiz: Sebastián [apellidos]</w:t>
+        <w:t xml:space="preserve">Aprendiz: Eimer Sebastián Rojas Cañas</w:t>
       </w:r>
     </w:p>
     <w:p>
@@ -99,12 +108,12 @@
         <w:jc w:val="center"/>
       </w:pPr>
       <w:r>
-        <w:t xml:space="preserve">Instructora: Alva [apellidos]</w:t>
-      </w:r>
-    </w:p>
-    <w:p>
-      <w:pPr>
-        <w:spacing w:before="800"/>
+        <w:t xml:space="preserve">Instructora: Alba Rocío Cuchigay Rosas</w:t>
+      </w:r>
+    </w:p>
+    <w:p>
+      <w:pPr>
+        <w:spacing w:before="700"/>
       </w:pPr>
     </w:p>
     <w:p>
@@ -122,7 +131,7 @@
         <w:jc w:val="center"/>
       </w:pPr>
       <w:r>
-        <w:t xml:space="preserve">Octubre de 2026</w:t>
+        <w:t xml:space="preserve">2026</w:t>
       </w:r>
     </w:p>
     <w:p>
@@ -148,7 +157,7 @@
           <w:sz w:val="20"/>
           <w:szCs w:val="20"/>
         </w:rPr>
-        <w:t xml:space="preserve">Este documento es para COPIAR A MANO en el cuaderno. Resume con tus palabras, usa colores y dibuja los diagramas. Borra esta nota si lo vas a imprimir.</w:t>
+        <w:t xml:space="preserve">Este documento es para COPIAR A MANO en el cuaderno. Resume con tus palabras, usa colores y dibuja el diagrama. Borra esta nota si lo vas a imprimir.</w:t>
       </w:r>
     </w:p>
     <w:p>
@@ -243,6 +252,22 @@
     </w:p>
     <w:p>
       <w:pPr>
+        <w:spacing w:after="120" w:line="300"/>
+        <w:jc w:val="both"/>
+      </w:pPr>
+      <w:r>
+        <w:rPr>
+          <w:i/>
+          <w:iCs/>
+          <w:color w:val="666666"/>
+          <w:sz w:val="18"/>
+          <w:szCs w:val="18"/>
+        </w:rPr>
+        <w:t xml:space="preserve">Fuente: informe "Portafolio digital para la intervención de procesos administrativos con enfoque de innovación en la empresa Luna de Cristal" (fase de planeación, 2026): entrevista a la propietaria (24/06/2026), encuesta a 2 colaboradores, 45 clientas y 5 proveedores.</w:t>
+      </w:r>
+    </w:p>
+    <w:p>
+      <w:pPr>
         <w:pStyle w:val="Heading2"/>
         <w:spacing w:after="120" w:before="200"/>
       </w:pPr>
@@ -256,7 +281,7 @@
         <w:jc w:val="both"/>
       </w:pPr>
       <w:r>
-        <w:t xml:space="preserve">Luna de Cristal es un establecimiento comercial de tipo familiar ubicado en el municipio de Yopal, Casanare, dedicado a la venta de ropa para dama y perfumes. El negocio funciona en un local físico [dirección del local] y es administrado en el día a día por la dueña, [nombre de la mamá], mientras que el registro mercantil ante la Cámara de Comercio de Casanare está a nombre del aprendiz. La empresa ofrece atención personalizada, asesoría a las clientas y envío gratis dentro de la ciudad.</w:t>
+        <w:t xml:space="preserve">Luna de Cristal es una microempresa familiar fundada en 2026, constituida como persona natural y registrada en la Cámara de Comercio de Casanare. Está ubicada en la Carrera 19 # 23-57, en el centro de Yopal, y vende ropa femenina (jeans, vestidos, faldas, shorts y bodys), perfumes y accesorios como correas. Trabaja con dos personas: la propietaria, que dirige el negocio, hace las compras y maneja las redes, y un asesor de ventas.</w:t>
       </w:r>
     </w:p>
     <w:p>
@@ -265,23 +290,7 @@
         <w:jc w:val="both"/>
       </w:pPr>
       <w:r>
-        <w:t xml:space="preserve">Sus productos principales son prendas de vestir femeninas (blusas, pantalones, vestidos y otras prendas) y perfumes con precios entre $80.000 y $120.000, que son los productos de mayor valor y margen del negocio. [Agregar: año en que empezó a funcionar y número de personas que trabajan en el local].</w:t>
-      </w:r>
-    </w:p>
-    <w:p>
-      <w:pPr>
-        <w:shd w:fill="FFF4D6" w:color="auto" w:val="clear"/>
-        <w:spacing w:after="120"/>
-      </w:pPr>
-      <w:r>
-        <w:rPr>
-          <w:i/>
-          <w:iCs/>
-          <w:color w:val="7A5A00"/>
-          <w:sz w:val="20"/>
-          <w:szCs w:val="20"/>
-        </w:rPr>
-        <w:t xml:space="preserve">Completa los datos entre corchetes [ ] con la información real (dirección, año de apertura, nombre de tu mamá, empleados).</w:t>
+        <w:t xml:space="preserve">Atiende en promedio siete clientas al día, mujeres de 16 a 60 años de estratos 1, 2 y 3 de Yopal y municipios cercanos. Vende más los viernes, sábados y fechas especiales. Su misión es brindar a las mujeres prendas, perfumes y accesorios de calidad con una experiencia cercana y accesible, y su visión es ser, para 2030, una de las tiendas de moda femenina más reconocidas de Casanare, combinando venta física y digital.</w:t>
       </w:r>
     </w:p>
     <w:p>
@@ -299,63 +308,7 @@
         <w:jc w:val="both"/>
       </w:pPr>
       <w:r>
-        <w:t xml:space="preserve">Luna de Cristal pertenece al sector comercio, específicamente al comercio al por menor (venta directa al consumidor final) en establecimiento especializado. Según la Clasificación Industrial Internacional Uniforme (CIIU Rev. 4 A.C.), su actividad corresponde a:</w:t>
-      </w:r>
-    </w:p>
-    <w:p>
-      <w:pPr>
-        <w:pStyle w:val="ListParagraph"/>
-        <w:numPr>
-          <w:ilvl w:val="0"/>
-          <w:numId w:val="2"/>
-        </w:numPr>
-        <w:spacing w:after="80" w:line="280"/>
-      </w:pPr>
-      <w:r>
-        <w:rPr>
-          <w:b/>
-          <w:bCs/>
-        </w:rPr>
-        <w:t xml:space="preserve">CIIU 4771 –</w:t>
-      </w:r>
-      <w:r>
-        <w:t xml:space="preserve"> Comercio al por menor de prendas de vestir y sus accesorios en establecimientos especializados (actividad principal).</w:t>
-      </w:r>
-    </w:p>
-    <w:p>
-      <w:pPr>
-        <w:pStyle w:val="ListParagraph"/>
-        <w:numPr>
-          <w:ilvl w:val="0"/>
-          <w:numId w:val="2"/>
-        </w:numPr>
-        <w:spacing w:after="80" w:line="280"/>
-      </w:pPr>
-      <w:r>
-        <w:rPr>
-          <w:b/>
-          <w:bCs/>
-        </w:rPr>
-        <w:t xml:space="preserve">CIIU 4773 –</w:t>
-      </w:r>
-      <w:r>
-        <w:t xml:space="preserve"> Comercio al por menor de productos farmacéuticos y medicinales, cosméticos y artículos de tocador en establecimientos especializados (venta de perfumes, actividad secundaria).</w:t>
-      </w:r>
-    </w:p>
-    <w:p>
-      <w:pPr>
-        <w:shd w:fill="FFF4D6" w:color="auto" w:val="clear"/>
-        <w:spacing w:after="120"/>
-      </w:pPr>
-      <w:r>
-        <w:rPr>
-          <w:i/>
-          <w:iCs/>
-          <w:color w:val="7A5A00"/>
-          <w:sz w:val="20"/>
-          <w:szCs w:val="20"/>
-        </w:rPr>
-        <w:t xml:space="preserve">Verifica los códigos en el certificado de Cámara de Comercio o en el RUT del negocio; usa los que aparezcan ahí.</w:t>
+        <w:t xml:space="preserve">Pertenece al sector terciario (comercio), en el subsector de comercio al por menor en establecimientos especializados. Sus códigos CIIU van del 4771 al 4773: comercio al por menor de prendas de vestir y accesorios (4771) y de cosméticos, perfumes y artículos de tocador (4773). Compra a proveedores de Bogotá, Medellín y Bucaramanga y a la plataforma Shein, y vende en el local, por redes sociales y con domicilio.</w:t>
       </w:r>
     </w:p>
     <w:p>
@@ -373,7 +326,7 @@
         <w:jc w:val="both"/>
       </w:pPr>
       <w:r>
-        <w:t xml:space="preserve">A partir de la observación del funcionamiento del negocio se identificaron los siguientes procesos, clasificados en estratégicos, misionales y de apoyo:</w:t>
+        <w:t xml:space="preserve">La empresa tiene una estructura horizontal y familiar: una Dirección General y dos áreas (canal de ventas físico y canal de ventas digital), más el servicio de domicilios. Sus procesos se clasifican así:</w:t>
       </w:r>
     </w:p>
     <w:tbl>
@@ -518,7 +471,7 @@
                 <w:sz w:val="19"/>
                 <w:szCs w:val="19"/>
               </w:rPr>
-              <w:t xml:space="preserve">(dirección del negocio)</w:t>
+              <w:t xml:space="preserve">(Dirección General)</w:t>
             </w:r>
           </w:p>
         </w:tc>
@@ -571,7 +524,7 @@
                 <w:sz w:val="19"/>
                 <w:szCs w:val="19"/>
               </w:rPr>
-              <w:t xml:space="preserve">Toma de decisiones sobre el rumbo del negocio.</w:t>
+              <w:t xml:space="preserve">Decisiones de crecimiento (sucursales, visión 2030).</w:t>
             </w:r>
           </w:p>
         </w:tc>
@@ -596,7 +549,7 @@
                 <w:sz w:val="19"/>
                 <w:szCs w:val="19"/>
               </w:rPr>
-              <w:t xml:space="preserve">Se hacen de manera informal y con base en la experiencia de la dueña, sin datos registrados ni un plan escrito.</w:t>
+              <w:t xml:space="preserve">Los maneja la propietaria con base en su experiencia, sin indicadores ni un plan comercial escrito.</w:t>
             </w:r>
           </w:p>
         </w:tc>
@@ -640,7 +593,7 @@
                 <w:sz w:val="19"/>
                 <w:szCs w:val="19"/>
               </w:rPr>
-              <w:t xml:space="preserve">(razón de ser del negocio)</w:t>
+              <w:t xml:space="preserve">(razón de ser)</w:t>
             </w:r>
           </w:p>
         </w:tc>
@@ -665,49 +618,49 @@
                 <w:sz w:val="19"/>
                 <w:szCs w:val="19"/>
               </w:rPr>
-              <w:t xml:space="preserve">Compra de mercancía a proveedores.</w:t>
-            </w:r>
-          </w:p>
-          <w:p>
-            <w:pPr>
-              <w:spacing w:after="40"/>
-            </w:pPr>
-            <w:r>
-              <w:rPr>
-                <w:b w:val="false"/>
-                <w:bCs w:val="false"/>
-                <w:sz w:val="19"/>
-                <w:szCs w:val="19"/>
-              </w:rPr>
-              <w:t xml:space="preserve">Exhibición de productos y vitrina.</w:t>
-            </w:r>
-          </w:p>
-          <w:p>
-            <w:pPr>
-              <w:spacing w:after="40"/>
-            </w:pPr>
-            <w:r>
-              <w:rPr>
-                <w:b w:val="false"/>
-                <w:bCs w:val="false"/>
-                <w:sz w:val="19"/>
-                <w:szCs w:val="19"/>
-              </w:rPr>
-              <w:t xml:space="preserve">Atención y asesoría a las clientas.</w:t>
-            </w:r>
-          </w:p>
-          <w:p>
-            <w:pPr>
-              <w:spacing w:after="40"/>
-            </w:pPr>
-            <w:r>
-              <w:rPr>
-                <w:b w:val="false"/>
-                <w:bCs w:val="false"/>
-                <w:sz w:val="19"/>
-                <w:szCs w:val="19"/>
-              </w:rPr>
-              <w:t xml:space="preserve">Venta, cobro y entrega (domicilio gratis en Yopal).</w:t>
+              <w:t xml:space="preserve">Compra a proveedores nacionales e internacionales.</w:t>
+            </w:r>
+          </w:p>
+          <w:p>
+            <w:pPr>
+              <w:spacing w:after="40"/>
+            </w:pPr>
+            <w:r>
+              <w:rPr>
+                <w:b w:val="false"/>
+                <w:bCs w:val="false"/>
+                <w:sz w:val="19"/>
+                <w:szCs w:val="19"/>
+              </w:rPr>
+              <w:t xml:space="preserve">Exhibición en vitrinas y estanterías.</w:t>
+            </w:r>
+          </w:p>
+          <w:p>
+            <w:pPr>
+              <w:spacing w:after="40"/>
+            </w:pPr>
+            <w:r>
+              <w:rPr>
+                <w:b w:val="false"/>
+                <w:bCs w:val="false"/>
+                <w:sz w:val="19"/>
+                <w:szCs w:val="19"/>
+              </w:rPr>
+              <w:t xml:space="preserve">Atención personalizada en el local.</w:t>
+            </w:r>
+          </w:p>
+          <w:p>
+            <w:pPr>
+              <w:spacing w:after="40"/>
+            </w:pPr>
+            <w:r>
+              <w:rPr>
+                <w:b w:val="false"/>
+                <w:bCs w:val="false"/>
+                <w:sz w:val="19"/>
+                <w:szCs w:val="19"/>
+              </w:rPr>
+              <w:t xml:space="preserve">Venta física, venta por redes y domicilios.</w:t>
             </w:r>
           </w:p>
         </w:tc>
@@ -732,7 +685,7 @@
                 <w:sz w:val="19"/>
                 <w:szCs w:val="19"/>
               </w:rPr>
-              <w:t xml:space="preserve">La atención en el local es buena y cercana, pero la venta depende casi solo de las clientas que pasan o ya conocen la tienda.</w:t>
+              <w:t xml:space="preserve">La atención es la mayor fortaleza; las ventas dependen de las clientas que ya conocen la tienda.</w:t>
             </w:r>
           </w:p>
         </w:tc>
@@ -776,7 +729,7 @@
                 <w:sz w:val="19"/>
                 <w:szCs w:val="19"/>
               </w:rPr>
-              <w:t xml:space="preserve">(soporte a la operación)</w:t>
+              <w:t xml:space="preserve">(soporte)</w:t>
             </w:r>
           </w:p>
         </w:tc>
@@ -801,49 +754,49 @@
                 <w:sz w:val="19"/>
                 <w:szCs w:val="19"/>
               </w:rPr>
-              <w:t xml:space="preserve">Control de inventario.</w:t>
-            </w:r>
-          </w:p>
-          <w:p>
-            <w:pPr>
-              <w:spacing w:after="40"/>
-            </w:pPr>
-            <w:r>
-              <w:rPr>
-                <w:b w:val="false"/>
-                <w:bCs w:val="false"/>
-                <w:sz w:val="19"/>
-                <w:szCs w:val="19"/>
-              </w:rPr>
-              <w:t xml:space="preserve">Manejo de caja y registro de ventas.</w:t>
-            </w:r>
-          </w:p>
-          <w:p>
-            <w:pPr>
-              <w:spacing w:after="40"/>
-            </w:pPr>
-            <w:r>
-              <w:rPr>
-                <w:b w:val="false"/>
-                <w:bCs w:val="false"/>
-                <w:sz w:val="19"/>
-                <w:szCs w:val="19"/>
-              </w:rPr>
-              <w:t xml:space="preserve">Redes sociales y WhatsApp.</w:t>
-            </w:r>
-          </w:p>
-          <w:p>
-            <w:pPr>
-              <w:spacing w:after="40"/>
-            </w:pPr>
-            <w:r>
-              <w:rPr>
-                <w:b w:val="false"/>
-                <w:bCs w:val="false"/>
-                <w:sz w:val="19"/>
-                <w:szCs w:val="19"/>
-              </w:rPr>
-              <w:t xml:space="preserve">Aseo y mantenimiento del local.</w:t>
+              <w:t xml:space="preserve">Inventario y registro de ventas.</w:t>
+            </w:r>
+          </w:p>
+          <w:p>
+            <w:pPr>
+              <w:spacing w:after="40"/>
+            </w:pPr>
+            <w:r>
+              <w:rPr>
+                <w:b w:val="false"/>
+                <w:bCs w:val="false"/>
+                <w:sz w:val="19"/>
+                <w:szCs w:val="19"/>
+              </w:rPr>
+              <w:t xml:space="preserve">Facturación y caja.</w:t>
+            </w:r>
+          </w:p>
+          <w:p>
+            <w:pPr>
+              <w:spacing w:after="40"/>
+            </w:pPr>
+            <w:r>
+              <w:rPr>
+                <w:b w:val="false"/>
+                <w:bCs w:val="false"/>
+                <w:sz w:val="19"/>
+                <w:szCs w:val="19"/>
+              </w:rPr>
+              <w:t xml:space="preserve">Redes sociales y publicidad en Meta Ads.</w:t>
+            </w:r>
+          </w:p>
+          <w:p>
+            <w:pPr>
+              <w:spacing w:after="40"/>
+            </w:pPr>
+            <w:r>
+              <w:rPr>
+                <w:b w:val="false"/>
+                <w:bCs w:val="false"/>
+                <w:sz w:val="19"/>
+                <w:szCs w:val="19"/>
+              </w:rPr>
+              <w:t xml:space="preserve">Talento humano, seguridad y ambiente.</w:t>
             </w:r>
           </w:p>
         </w:tc>
@@ -868,7 +821,7 @@
                 <w:sz w:val="19"/>
                 <w:szCs w:val="19"/>
               </w:rPr>
-              <w:t xml:space="preserve">No hay registro diario de ventas, el inventario no se revisa por antigüedad y las redes sociales están inactivas.</w:t>
+              <w:t xml:space="preserve">Inventario y ventas se llevan a mano, sin sistema POS ni facturación electrónica. Las redes se usan, pero con poco alcance.</w:t>
             </w:r>
           </w:p>
         </w:tc>
@@ -897,110 +850,130 @@
           <w:b/>
           <w:bCs/>
         </w:rPr>
-        <w:t xml:space="preserve">Producto:</w:t>
-      </w:r>
-      <w:r>
-        <w:t xml:space="preserve"> productos de buena calidad y con buen margen de ganancia, en especial los perfumes.</w:t>
-      </w:r>
-    </w:p>
-    <w:p>
-      <w:pPr>
-        <w:pStyle w:val="ListParagraph"/>
-        <w:numPr>
-          <w:ilvl w:val="0"/>
-          <w:numId w:val="2"/>
-        </w:numPr>
-        <w:spacing w:after="80" w:line="280"/>
-      </w:pPr>
-      <w:r>
-        <w:rPr>
-          <w:b/>
-          <w:bCs/>
-        </w:rPr>
-        <w:t xml:space="preserve">Local propio:</w:t>
-      </w:r>
-      <w:r>
-        <w:t xml:space="preserve"> cuenta con local físico, lo que genera confianza y permite que las clientas vean y se midan las prendas.</w:t>
-      </w:r>
-    </w:p>
-    <w:p>
-      <w:pPr>
-        <w:pStyle w:val="ListParagraph"/>
-        <w:numPr>
-          <w:ilvl w:val="0"/>
-          <w:numId w:val="2"/>
-        </w:numPr>
-        <w:spacing w:after="80" w:line="280"/>
-      </w:pPr>
-      <w:r>
-        <w:rPr>
-          <w:b/>
-          <w:bCs/>
-        </w:rPr>
-        <w:t xml:space="preserve">Atención:</w:t>
-      </w:r>
-      <w:r>
-        <w:t xml:space="preserve"> trato cercano y asesoría personalizada propia de un negocio familiar.</w:t>
-      </w:r>
-    </w:p>
-    <w:p>
-      <w:pPr>
-        <w:pStyle w:val="ListParagraph"/>
-        <w:numPr>
-          <w:ilvl w:val="0"/>
-          <w:numId w:val="2"/>
-        </w:numPr>
-        <w:spacing w:after="80" w:line="280"/>
-      </w:pPr>
-      <w:r>
-        <w:rPr>
-          <w:b/>
-          <w:bCs/>
-        </w:rPr>
-        <w:t xml:space="preserve">Domicilio:</w:t>
-      </w:r>
-      <w:r>
-        <w:t xml:space="preserve"> envío gratis dentro de Yopal, una ventaja frente a la compra por internet.</w:t>
-      </w:r>
-    </w:p>
-    <w:p>
-      <w:pPr>
-        <w:pStyle w:val="ListParagraph"/>
-        <w:numPr>
-          <w:ilvl w:val="0"/>
-          <w:numId w:val="2"/>
-        </w:numPr>
-        <w:spacing w:after="80" w:line="280"/>
-      </w:pPr>
-      <w:r>
-        <w:rPr>
-          <w:b/>
-          <w:bCs/>
-        </w:rPr>
-        <w:t xml:space="preserve">Portafolio complementario:</w:t>
-      </w:r>
-      <w:r>
-        <w:t xml:space="preserve"> vender ropa y perfume en el mismo lugar permite armar combos y aumentar el valor de cada compra.</w:t>
-      </w:r>
-    </w:p>
-    <w:p>
-      <w:pPr>
-        <w:pStyle w:val="ListParagraph"/>
-        <w:numPr>
-          <w:ilvl w:val="0"/>
-          <w:numId w:val="2"/>
-        </w:numPr>
-        <w:spacing w:after="80" w:line="280"/>
-      </w:pPr>
-      <w:r>
-        <w:rPr>
-          <w:b/>
-          <w:bCs/>
-        </w:rPr>
-        <w:t xml:space="preserve">Disposición al cambio:</w:t>
-      </w:r>
-      <w:r>
-        <w:t xml:space="preserve"> la dueña está dispuesta a probar nuevas formas de vender.</w:t>
+        <w:t xml:space="preserve">Atención cercana y personalizada:</w:t>
+      </w:r>
+      <w:r>
+        <w:t xml:space="preserve"> es lo que más valoran las clientas y lo que la propietaria considera su diferencia.</w:t>
+      </w:r>
+    </w:p>
+    <w:p>
+      <w:pPr>
+        <w:pStyle w:val="ListParagraph"/>
+        <w:numPr>
+          <w:ilvl w:val="0"/>
+          <w:numId w:val="2"/>
+        </w:numPr>
+        <w:spacing w:after="80" w:line="280"/>
+      </w:pPr>
+      <w:r>
+        <w:rPr>
+          <w:b/>
+          <w:bCs/>
+        </w:rPr>
+        <w:t xml:space="preserve">Precios cómodos:</w:t>
+      </w:r>
+      <w:r>
+        <w:t xml:space="preserve"> un pantalón cuesta alrededor de $97.000, frente a $120.000 a $150.000 en la competencia.</w:t>
+      </w:r>
+    </w:p>
+    <w:p>
+      <w:pPr>
+        <w:pStyle w:val="ListParagraph"/>
+        <w:numPr>
+          <w:ilvl w:val="0"/>
+          <w:numId w:val="2"/>
+        </w:numPr>
+        <w:spacing w:after="80" w:line="280"/>
+      </w:pPr>
+      <w:r>
+        <w:rPr>
+          <w:b/>
+          <w:bCs/>
+        </w:rPr>
+        <w:t xml:space="preserve">Clientas fieles:</w:t>
+      </w:r>
+      <w:r>
+        <w:t xml:space="preserve"> el 93,3 % de las clientas encuestadas recomendaría la tienda y el 88,9 % la visita con frecuencia.</w:t>
+      </w:r>
+    </w:p>
+    <w:p>
+      <w:pPr>
+        <w:pStyle w:val="ListParagraph"/>
+        <w:numPr>
+          <w:ilvl w:val="0"/>
+          <w:numId w:val="2"/>
+        </w:numPr>
+        <w:spacing w:after="80" w:line="280"/>
+      </w:pPr>
+      <w:r>
+        <w:rPr>
+          <w:b/>
+          <w:bCs/>
+        </w:rPr>
+        <w:t xml:space="preserve">Ubicación céntrica:</w:t>
+      </w:r>
+      <w:r>
+        <w:t xml:space="preserve"> local en el centro de Yopal, con buen horario (88,9 % lo aprueba) e infraestructura adecuada (84,4 %).</w:t>
+      </w:r>
+    </w:p>
+    <w:p>
+      <w:pPr>
+        <w:pStyle w:val="ListParagraph"/>
+        <w:numPr>
+          <w:ilvl w:val="0"/>
+          <w:numId w:val="2"/>
+        </w:numPr>
+        <w:spacing w:after="80" w:line="280"/>
+      </w:pPr>
+      <w:r>
+        <w:rPr>
+          <w:b/>
+          <w:bCs/>
+        </w:rPr>
+        <w:t xml:space="preserve">Buen ambiente de trabajo:</w:t>
+      </w:r>
+      <w:r>
+        <w:t xml:space="preserve"> el 100 % de los colaboradores se siente motivado, dice que hay buena comunicación y recibió capacitación este año.</w:t>
+      </w:r>
+    </w:p>
+    <w:p>
+      <w:pPr>
+        <w:pStyle w:val="ListParagraph"/>
+        <w:numPr>
+          <w:ilvl w:val="0"/>
+          <w:numId w:val="2"/>
+        </w:numPr>
+        <w:spacing w:after="80" w:line="280"/>
+      </w:pPr>
+      <w:r>
+        <w:rPr>
+          <w:b/>
+          <w:bCs/>
+        </w:rPr>
+        <w:t xml:space="preserve">Buenas relaciones con proveedores:</w:t>
+      </w:r>
+      <w:r>
+        <w:t xml:space="preserve"> el 100 % de los proveedores seguiría trabajando con la empresa y la recomendaría; el 80 % dice que está abierta a nuevas propuestas.</w:t>
+      </w:r>
+    </w:p>
+    <w:p>
+      <w:pPr>
+        <w:pStyle w:val="ListParagraph"/>
+        <w:numPr>
+          <w:ilvl w:val="0"/>
+          <w:numId w:val="2"/>
+        </w:numPr>
+        <w:spacing w:after="80" w:line="280"/>
+      </w:pPr>
+      <w:r>
+        <w:rPr>
+          <w:b/>
+          <w:bCs/>
+        </w:rPr>
+        <w:t xml:space="preserve">Presencia en redes:</w:t>
+      </w:r>
+      <w:r>
+        <w:t xml:space="preserve"> ya usa WhatsApp, TikTok, Facebook, Instagram y publicidad en Meta Ads.</w:t>
       </w:r>
     </w:p>
     <w:p>
@@ -1026,90 +999,130 @@
           <w:b/>
           <w:bCs/>
         </w:rPr>
-        <w:t xml:space="preserve">Baja visibilidad:</w:t>
-      </w:r>
-      <w:r>
-        <w:t xml:space="preserve"> muchas personas de Yopal no saben que la tienda existe. Las redes sociales están inactivas y el negocio no aparece en Google Maps.</w:t>
-      </w:r>
-    </w:p>
-    <w:p>
-      <w:pPr>
-        <w:pStyle w:val="ListParagraph"/>
-        <w:numPr>
-          <w:ilvl w:val="0"/>
-          <w:numId w:val="2"/>
-        </w:numPr>
-        <w:spacing w:after="80" w:line="280"/>
-      </w:pPr>
-      <w:r>
-        <w:rPr>
-          <w:b/>
-          <w:bCs/>
-        </w:rPr>
-        <w:t xml:space="preserve">Inventario estancado:</w:t>
-      </w:r>
-      <w:r>
-        <w:t xml:space="preserve"> hay prendas que llevan meses sin venderse, lo que representa dinero detenido.</w:t>
-      </w:r>
-    </w:p>
-    <w:p>
-      <w:pPr>
-        <w:pStyle w:val="ListParagraph"/>
-        <w:numPr>
-          <w:ilvl w:val="0"/>
-          <w:numId w:val="2"/>
-        </w:numPr>
-        <w:spacing w:after="80" w:line="280"/>
-      </w:pPr>
-      <w:r>
-        <w:rPr>
-          <w:b/>
-          <w:bCs/>
-        </w:rPr>
-        <w:t xml:space="preserve">Falta de medición:</w:t>
-      </w:r>
-      <w:r>
-        <w:t xml:space="preserve"> no se registran las ventas diarias ni de dónde llegan las clientas, por lo que las decisiones se toman sin información.</w:t>
-      </w:r>
-    </w:p>
-    <w:p>
-      <w:pPr>
-        <w:pStyle w:val="ListParagraph"/>
-        <w:numPr>
-          <w:ilvl w:val="0"/>
-          <w:numId w:val="2"/>
-        </w:numPr>
-        <w:spacing w:after="80" w:line="280"/>
-      </w:pPr>
-      <w:r>
-        <w:rPr>
-          <w:b/>
-          <w:bCs/>
-        </w:rPr>
-        <w:t xml:space="preserve">Atención digital lenta:</w:t>
-      </w:r>
-      <w:r>
-        <w:t xml:space="preserve"> no se usa WhatsApp Business y los mensajes no siempre se responden a tiempo, lo que hace perder ventas.</w:t>
-      </w:r>
-    </w:p>
-    <w:p>
-      <w:pPr>
-        <w:pStyle w:val="ListParagraph"/>
-        <w:numPr>
-          <w:ilvl w:val="0"/>
-          <w:numId w:val="2"/>
-        </w:numPr>
-        <w:spacing w:after="80" w:line="280"/>
-      </w:pPr>
-      <w:r>
-        <w:rPr>
-          <w:b/>
-          <w:bCs/>
-        </w:rPr>
-        <w:t xml:space="preserve">Sin estrategia comercial:</w:t>
-      </w:r>
-      <w:r>
-        <w:t xml:space="preserve"> no existe un calendario de promociones ni se aprovechan las temporadas comerciales.</w:t>
+        <w:t xml:space="preserve">Poca visibilidad:</w:t>
+      </w:r>
+      <w:r>
+        <w:t xml:space="preserve"> la propietaria señala el bajo alcance en redes como una de las situaciones que más afecta las ventas. Además, la tienda no aparece en Google Maps.</w:t>
+      </w:r>
+    </w:p>
+    <w:p>
+      <w:pPr>
+        <w:pStyle w:val="ListParagraph"/>
+        <w:numPr>
+          <w:ilvl w:val="0"/>
+          <w:numId w:val="2"/>
+        </w:numPr>
+        <w:spacing w:after="80" w:line="280"/>
+      </w:pPr>
+      <w:r>
+        <w:rPr>
+          <w:b/>
+          <w:bCs/>
+        </w:rPr>
+        <w:t xml:space="preserve">Procesos manuales:</w:t>
+      </w:r>
+      <w:r>
+        <w:t xml:space="preserve"> no hay sistema POS, facturación electrónica ni inventario sistematizado; todo se lleva a mano. El 100 % de los colaboradores dice que la tecnología es lo que más hay que mejorar.</w:t>
+      </w:r>
+    </w:p>
+    <w:p>
+      <w:pPr>
+        <w:pStyle w:val="ListParagraph"/>
+        <w:numPr>
+          <w:ilvl w:val="0"/>
+          <w:numId w:val="2"/>
+        </w:numPr>
+        <w:spacing w:after="80" w:line="280"/>
+      </w:pPr>
+      <w:r>
+        <w:rPr>
+          <w:b/>
+          <w:bCs/>
+        </w:rPr>
+        <w:t xml:space="preserve">Decisiones sin datos:</w:t>
+      </w:r>
+      <w:r>
+        <w:t xml:space="preserve"> sin registro sistematizado no se sabe con exactitud qué se vende más, qué queda quieto ni de dónde llegan las clientas.</w:t>
+      </w:r>
+    </w:p>
+    <w:p>
+      <w:pPr>
+        <w:pStyle w:val="ListParagraph"/>
+        <w:numPr>
+          <w:ilvl w:val="0"/>
+          <w:numId w:val="2"/>
+        </w:numPr>
+        <w:spacing w:after="80" w:line="280"/>
+      </w:pPr>
+      <w:r>
+        <w:rPr>
+          <w:b/>
+          <w:bCs/>
+        </w:rPr>
+        <w:t xml:space="preserve">Inventario con baja rotación:</w:t>
+      </w:r>
+      <w:r>
+        <w:t xml:space="preserve"> hay prendas que llevan tiempo sin venderse, lo que representa dinero detenido.</w:t>
+      </w:r>
+    </w:p>
+    <w:p>
+      <w:pPr>
+        <w:pStyle w:val="ListParagraph"/>
+        <w:numPr>
+          <w:ilvl w:val="0"/>
+          <w:numId w:val="2"/>
+        </w:numPr>
+        <w:spacing w:after="80" w:line="280"/>
+      </w:pPr>
+      <w:r>
+        <w:rPr>
+          <w:b/>
+          <w:bCs/>
+        </w:rPr>
+        <w:t xml:space="preserve">Cultura organizacional poco documentada:</w:t>
+      </w:r>
+      <w:r>
+        <w:t xml:space="preserve"> ningún colaborador conoce los valores, las políticas ni el organigrama (0 %), y solo uno de dos conoce el manual de funciones.</w:t>
+      </w:r>
+    </w:p>
+    <w:p>
+      <w:pPr>
+        <w:pStyle w:val="ListParagraph"/>
+        <w:numPr>
+          <w:ilvl w:val="0"/>
+          <w:numId w:val="2"/>
+        </w:numPr>
+        <w:spacing w:after="80" w:line="280"/>
+      </w:pPr>
+      <w:r>
+        <w:rPr>
+          <w:b/>
+          <w:bCs/>
+        </w:rPr>
+        <w:t xml:space="preserve">Comunicación con proveedores:</w:t>
+      </w:r>
+      <w:r>
+        <w:t xml:space="preserve"> el 60 % de los proveedores dice que la empresa solo "algunas veces" usa medios innovadores para comunicarse o da retroalimentación.</w:t>
+      </w:r>
+    </w:p>
+    <w:p>
+      <w:pPr>
+        <w:pStyle w:val="ListParagraph"/>
+        <w:numPr>
+          <w:ilvl w:val="0"/>
+          <w:numId w:val="2"/>
+        </w:numPr>
+        <w:spacing w:after="80" w:line="280"/>
+      </w:pPr>
+      <w:r>
+        <w:rPr>
+          <w:b/>
+          <w:bCs/>
+        </w:rPr>
+        <w:t xml:space="preserve">Entorno exigente:</w:t>
+      </w:r>
+      <w:r>
+        <w:t xml:space="preserve"> competidores con más trayectoria (Alta Moda, Dana's Closet, Lorena Fernández, Surtitodo), lluvias que bajan el flujo de clientas, inflación, IVA y costo de envíos.</w:t>
       </w:r>
     </w:p>
     <w:p>
@@ -1135,110 +1148,110 @@
           <w:b/>
           <w:bCs/>
         </w:rPr>
-        <w:t xml:space="preserve">Presencia en Google Maps:</w:t>
-      </w:r>
-      <w:r>
-        <w:t xml:space="preserve"> crear y verificar el perfil gratuito de Google Business Profile (Google Maps) y conseguir reseñas de clientas.</w:t>
-      </w:r>
-    </w:p>
-    <w:p>
-      <w:pPr>
-        <w:pStyle w:val="ListParagraph"/>
-        <w:numPr>
-          <w:ilvl w:val="0"/>
-          <w:numId w:val="2"/>
-        </w:numPr>
-        <w:spacing w:after="80" w:line="280"/>
-      </w:pPr>
-      <w:r>
-        <w:rPr>
-          <w:b/>
-          <w:bCs/>
-        </w:rPr>
-        <w:t xml:space="preserve">WhatsApp Business:</w:t>
-      </w:r>
-      <w:r>
-        <w:t xml:space="preserve"> activar WhatsApp Business con catálogo, respuestas rápidas y mensaje de bienvenida.</w:t>
-      </w:r>
-    </w:p>
-    <w:p>
-      <w:pPr>
-        <w:pStyle w:val="ListParagraph"/>
-        <w:numPr>
-          <w:ilvl w:val="0"/>
-          <w:numId w:val="2"/>
-        </w:numPr>
-        <w:spacing w:after="80" w:line="280"/>
-      </w:pPr>
-      <w:r>
-        <w:rPr>
-          <w:b/>
-          <w:bCs/>
-        </w:rPr>
-        <w:t xml:space="preserve">Contenido en redes:</w:t>
-      </w:r>
-      <w:r>
-        <w:t xml:space="preserve"> publicar contenido constante en redes sociales con fotos reales de los productos.</w:t>
-      </w:r>
-    </w:p>
-    <w:p>
-      <w:pPr>
-        <w:pStyle w:val="ListParagraph"/>
-        <w:numPr>
-          <w:ilvl w:val="0"/>
-          <w:numId w:val="2"/>
-        </w:numPr>
-        <w:spacing w:after="80" w:line="280"/>
-      </w:pPr>
-      <w:r>
-        <w:rPr>
-          <w:b/>
-          <w:bCs/>
-        </w:rPr>
-        <w:t xml:space="preserve">Promociones:</w:t>
-      </w:r>
-      <w:r>
-        <w:t xml:space="preserve"> promociones creativas y controladas: "Jueves de Luna", "Ven con tu amiga", muestras de perfume y combos.</w:t>
-      </w:r>
-    </w:p>
-    <w:p>
-      <w:pPr>
-        <w:pStyle w:val="ListParagraph"/>
-        <w:numPr>
-          <w:ilvl w:val="0"/>
-          <w:numId w:val="2"/>
-        </w:numPr>
-        <w:spacing w:after="80" w:line="280"/>
-      </w:pPr>
-      <w:r>
-        <w:rPr>
-          <w:b/>
-          <w:bCs/>
-        </w:rPr>
-        <w:t xml:space="preserve">Temporadas:</w:t>
+        <w:t xml:space="preserve">Portafolio digital:</w:t>
+      </w:r>
+      <w:r>
+        <w:t xml:space="preserve"> catálogo organizado de ropa, perfumes y correas, que es el proyecto que se está diseñando.</w:t>
+      </w:r>
+    </w:p>
+    <w:p>
+      <w:pPr>
+        <w:pStyle w:val="ListParagraph"/>
+        <w:numPr>
+          <w:ilvl w:val="0"/>
+          <w:numId w:val="2"/>
+        </w:numPr>
+        <w:spacing w:after="80" w:line="280"/>
+      </w:pPr>
+      <w:r>
+        <w:rPr>
+          <w:b/>
+          <w:bCs/>
+        </w:rPr>
+        <w:t xml:space="preserve">Herramientas de control:</w:t>
+      </w:r>
+      <w:r>
+        <w:t xml:space="preserve"> sistema POS, facturación electrónica, lector de código de barras y datáfono, que la propia propietaria considera clave.</w:t>
+      </w:r>
+    </w:p>
+    <w:p>
+      <w:pPr>
+        <w:pStyle w:val="ListParagraph"/>
+        <w:numPr>
+          <w:ilvl w:val="0"/>
+          <w:numId w:val="2"/>
+        </w:numPr>
+        <w:spacing w:after="80" w:line="280"/>
+      </w:pPr>
+      <w:r>
+        <w:rPr>
+          <w:b/>
+          <w:bCs/>
+        </w:rPr>
+        <w:t xml:space="preserve">Visibilidad gratuita:</w:t>
+      </w:r>
+      <w:r>
+        <w:t xml:space="preserve"> perfil gratuito en Google Business Profile con fotos y reseñas de clientas, y catálogo en WhatsApp Business.</w:t>
+      </w:r>
+    </w:p>
+    <w:p>
+      <w:pPr>
+        <w:pStyle w:val="ListParagraph"/>
+        <w:numPr>
+          <w:ilvl w:val="0"/>
+          <w:numId w:val="2"/>
+        </w:numPr>
+        <w:spacing w:after="80" w:line="280"/>
+      </w:pPr>
+      <w:r>
+        <w:rPr>
+          <w:b/>
+          <w:bCs/>
+        </w:rPr>
+        <w:t xml:space="preserve">Promociones creativas:</w:t>
+      </w:r>
+      <w:r>
+        <w:t xml:space="preserve"> "Jueves de Luna", "Ven con tu amiga", muestras de perfume y combos, aprovechando que las ventas se concentran en viernes, sábados y fechas especiales.</w:t>
+      </w:r>
+    </w:p>
+    <w:p>
+      <w:pPr>
+        <w:pStyle w:val="ListParagraph"/>
+        <w:numPr>
+          <w:ilvl w:val="0"/>
+          <w:numId w:val="2"/>
+        </w:numPr>
+        <w:spacing w:after="80" w:line="280"/>
+      </w:pPr>
+      <w:r>
+        <w:rPr>
+          <w:b/>
+          <w:bCs/>
+        </w:rPr>
+        <w:t xml:space="preserve">Inteligencia artificial:</w:t>
+      </w:r>
+      <w:r>
+        <w:t xml:space="preserve"> mejorar fotos de producto y crear videos publicitarios con herramientas gratuitas para ganar alcance en redes.</w:t>
+      </w:r>
+    </w:p>
+    <w:p>
+      <w:pPr>
+        <w:pStyle w:val="ListParagraph"/>
+        <w:numPr>
+          <w:ilvl w:val="0"/>
+          <w:numId w:val="2"/>
+        </w:numPr>
+        <w:spacing w:after="80" w:line="280"/>
+      </w:pPr>
+      <w:r>
+        <w:rPr>
+          <w:b/>
+          <w:bCs/>
+        </w:rPr>
+        <w:t xml:space="preserve">Temporadas comerciales:</w:t>
       </w:r>
       <w:r>
         <w:t xml:space="preserve"> Halloween, Black Friday y diciembre, temporada fuerte para regalar perfumes.</w:t>
-      </w:r>
-    </w:p>
-    <w:p>
-      <w:pPr>
-        <w:pStyle w:val="ListParagraph"/>
-        <w:numPr>
-          <w:ilvl w:val="0"/>
-          <w:numId w:val="2"/>
-        </w:numPr>
-        <w:spacing w:after="80" w:line="280"/>
-      </w:pPr>
-      <w:r>
-        <w:rPr>
-          <w:b/>
-          <w:bCs/>
-        </w:rPr>
-        <w:t xml:space="preserve">Inteligencia artificial:</w:t>
-      </w:r>
-      <w:r>
-        <w:t xml:space="preserve"> usar herramientas gratuitas de inteligencia artificial para mejorar fotos, hacer videos publicitarios y, más adelante, responder mensajes.</w:t>
       </w:r>
     </w:p>
     <w:p>
@@ -1418,7 +1431,7 @@
         <w:jc w:val="both"/>
       </w:pPr>
       <w:r>
-        <w:t xml:space="preserve">Al investigar Luna de Cristal entendí que tener un buen producto no es suficiente para vender. El negocio de mi familia tiene ropa y perfumes de calidad, pero muchas personas en Yopal no saben que existe. Me di cuenta de que los problemas más importantes no estaban en lo que se vende, sino en cómo se da a conocer, cómo se atiende por medios digitales y en que no se miden los resultados.</w:t>
+        <w:t xml:space="preserve">Al investigar Luna de Cristal entendí que tener un buen producto no es suficiente para vender. La tienda tiene clientas fieles, buenos precios y una atención que la gente valora, pero muchas personas en Yopal todavía no la conocen. Los problemas más importantes no estaban en lo que se vende, sino en el poco alcance digital y en que todo se maneja a mano, sin datos para decidir.</w:t>
       </w:r>
     </w:p>
     <w:p>
@@ -1427,7 +1440,7 @@
         <w:jc w:val="both"/>
       </w:pPr>
       <w:r>
-        <w:t xml:space="preserve">También aprendí que innovar no siempre requiere dinero. Con creatividad y herramientas gratuitas, como Google Maps, WhatsApp Business y la inteligencia artificial, se pueden hacer cambios reales. Mi compromiso es aplicar el plan de 30 días, medir los resultados y mostrarlos a mi familia, para que esta experiencia sirva también como mi primer caso de éxito.</w:t>
+        <w:t xml:space="preserve">También aprendí que innovar no siempre requiere mucho dinero. Con creatividad y herramientas gratuitas, como Google Maps, WhatsApp Business, un portafolio digital y la inteligencia artificial, se pueden hacer cambios reales. Mi compromiso es aplicar el plan de 30 días, medir los resultados y mostrarlos a la empresa.</w:t>
       </w:r>
     </w:p>
     <w:sectPr>

</xml_diff>

<commit_message>
Cuaderno en versión intermedia (2 páginas)
Co-Authored-By: Claude Opus 5.5 <noreply@anthropic.com>
Claude-Session: https://claude.ai/code/session_01P9bj8o7UcwbCu86Zsog7Lb
</commit_message>
<xml_diff>
--- a/Actividad Alva instructora Luna de Cristal/1_CUADERNO_Lo_que_va_a_mano.docx
+++ b/Actividad Alva instructora Luna de Cristal/1_CUADERNO_Lo_que_va_a_mano.docx
@@ -24,7 +24,7 @@
           <w:sz w:val="20"/>
           <w:szCs w:val="20"/>
         </w:rPr>
-        <w:t xml:space="preserve">Versión corta para copiar rápido. Lo largo ya está en el Excel, el Word del Paso 3 y el PowerPoint.</w:t>
+        <w:t xml:space="preserve">Para copiar en el cuaderno. Lo completo está en el Excel, el Word del Paso 3 y el PowerPoint.</w:t>
       </w:r>
     </w:p>
     <w:p>
@@ -33,7 +33,7 @@
         <w:spacing w:after="60" w:before="160"/>
       </w:pPr>
       <w:r>
-        <w:t xml:space="preserve">Paso 1. Realidad de la empresa</w:t>
+        <w:t xml:space="preserve">Paso 1. Reconocer la realidad de la empresa</w:t>
       </w:r>
     </w:p>
     <w:p>
@@ -46,10 +46,46 @@
           <w:b/>
           <w:bCs/>
         </w:rPr>
-        <w:t xml:space="preserve">1. Descripción: </w:t>
-      </w:r>
-      <w:r>
-        <w:t xml:space="preserve">microempresa familiar (2026), centro de Yopal. Vende ropa, perfumes y correas. 2 personas. 7 clientas al día.</w:t>
+        <w:t xml:space="preserve">1. Descripción general</w:t>
+      </w:r>
+    </w:p>
+    <w:p>
+      <w:pPr>
+        <w:pStyle w:val="ListParagraph"/>
+        <w:numPr>
+          <w:ilvl w:val="0"/>
+          <w:numId w:val="2"/>
+        </w:numPr>
+        <w:spacing w:after="80" w:line="280"/>
+      </w:pPr>
+      <w:r>
+        <w:t xml:space="preserve">Microempresa familiar fundada en 2026, en la Carrera 19 # 23-57, centro de Yopal.</w:t>
+      </w:r>
+    </w:p>
+    <w:p>
+      <w:pPr>
+        <w:pStyle w:val="ListParagraph"/>
+        <w:numPr>
+          <w:ilvl w:val="0"/>
+          <w:numId w:val="2"/>
+        </w:numPr>
+        <w:spacing w:after="80" w:line="280"/>
+      </w:pPr>
+      <w:r>
+        <w:t xml:space="preserve">Vende ropa femenina (jeans, vestidos, faldas, bodys), perfumes y correas.</w:t>
+      </w:r>
+    </w:p>
+    <w:p>
+      <w:pPr>
+        <w:pStyle w:val="ListParagraph"/>
+        <w:numPr>
+          <w:ilvl w:val="0"/>
+          <w:numId w:val="2"/>
+        </w:numPr>
+        <w:spacing w:after="80" w:line="280"/>
+      </w:pPr>
+      <w:r>
+        <w:t xml:space="preserve">Trabajan 2 personas: la propietaria y un asesor. Atiende unas 7 clientas al día.</w:t>
       </w:r>
     </w:p>
     <w:p>
@@ -62,10 +98,33 @@
           <w:b/>
           <w:bCs/>
         </w:rPr>
-        <w:t xml:space="preserve">2. Actividad económica: </w:t>
-      </w:r>
-      <w:r>
-        <w:t xml:space="preserve">comercio al por menor (CIIU 4771 y 4773).</w:t>
+        <w:t xml:space="preserve">2. Actividad económica</w:t>
+      </w:r>
+    </w:p>
+    <w:p>
+      <w:pPr>
+        <w:pStyle w:val="ListParagraph"/>
+        <w:numPr>
+          <w:ilvl w:val="0"/>
+          <w:numId w:val="2"/>
+        </w:numPr>
+        <w:spacing w:after="80" w:line="280"/>
+      </w:pPr>
+      <w:r>
+        <w:t xml:space="preserve">Sector comercio, al por menor (CIIU 4771 ropa y 4773 perfumes).</w:t>
+      </w:r>
+    </w:p>
+    <w:p>
+      <w:pPr>
+        <w:pStyle w:val="ListParagraph"/>
+        <w:numPr>
+          <w:ilvl w:val="0"/>
+          <w:numId w:val="2"/>
+        </w:numPr>
+        <w:spacing w:after="80" w:line="280"/>
+      </w:pPr>
+      <w:r>
+        <w:t xml:space="preserve">Compra en Bogotá, Medellín, Bucaramanga y Shein; vende en el local, por redes y a domicilio.</w:t>
       </w:r>
     </w:p>
     <w:p>
@@ -78,10 +137,46 @@
           <w:b/>
           <w:bCs/>
         </w:rPr>
-        <w:t xml:space="preserve">3. Procesos: </w:t>
-      </w:r>
-      <w:r>
-        <w:t xml:space="preserve">estratégicos (compras, precios), misionales (atención, venta, domicilio) y de apoyo (inventario, caja, redes).</w:t>
+        <w:t xml:space="preserve">3. Procesos</w:t>
+      </w:r>
+    </w:p>
+    <w:p>
+      <w:pPr>
+        <w:pStyle w:val="ListParagraph"/>
+        <w:numPr>
+          <w:ilvl w:val="0"/>
+          <w:numId w:val="2"/>
+        </w:numPr>
+        <w:spacing w:after="80" w:line="280"/>
+      </w:pPr>
+      <w:r>
+        <w:t xml:space="preserve">Estratégicos: planear compras, precios y promociones.</w:t>
+      </w:r>
+    </w:p>
+    <w:p>
+      <w:pPr>
+        <w:pStyle w:val="ListParagraph"/>
+        <w:numPr>
+          <w:ilvl w:val="0"/>
+          <w:numId w:val="2"/>
+        </w:numPr>
+        <w:spacing w:after="80" w:line="280"/>
+      </w:pPr>
+      <w:r>
+        <w:t xml:space="preserve">Misionales: comprar, exhibir, atender, vender y entregar a domicilio.</w:t>
+      </w:r>
+    </w:p>
+    <w:p>
+      <w:pPr>
+        <w:pStyle w:val="ListParagraph"/>
+        <w:numPr>
+          <w:ilvl w:val="0"/>
+          <w:numId w:val="2"/>
+        </w:numPr>
+        <w:spacing w:after="80" w:line="280"/>
+      </w:pPr>
+      <w:r>
+        <w:t xml:space="preserve">De apoyo: inventario, caja y facturación, redes sociales.</w:t>
       </w:r>
     </w:p>
     <w:p>
@@ -94,10 +189,59 @@
           <w:b/>
           <w:bCs/>
         </w:rPr>
-        <w:t xml:space="preserve">4. Fortalezas: </w:t>
-      </w:r>
-      <w:r>
-        <w:t xml:space="preserve">atención cercana, precios cómodos, 93 % de clientas la recomienda.</w:t>
+        <w:t xml:space="preserve">4. Fortalezas</w:t>
+      </w:r>
+    </w:p>
+    <w:p>
+      <w:pPr>
+        <w:pStyle w:val="ListParagraph"/>
+        <w:numPr>
+          <w:ilvl w:val="0"/>
+          <w:numId w:val="2"/>
+        </w:numPr>
+        <w:spacing w:after="80" w:line="280"/>
+      </w:pPr>
+      <w:r>
+        <w:t xml:space="preserve">Atención cercana y personalizada.</w:t>
+      </w:r>
+    </w:p>
+    <w:p>
+      <w:pPr>
+        <w:pStyle w:val="ListParagraph"/>
+        <w:numPr>
+          <w:ilvl w:val="0"/>
+          <w:numId w:val="2"/>
+        </w:numPr>
+        <w:spacing w:after="80" w:line="280"/>
+      </w:pPr>
+      <w:r>
+        <w:t xml:space="preserve">Precios cómodos: un pantalón cuesta $97.000 y en la competencia de $120.000 a $150.000.</w:t>
+      </w:r>
+    </w:p>
+    <w:p>
+      <w:pPr>
+        <w:pStyle w:val="ListParagraph"/>
+        <w:numPr>
+          <w:ilvl w:val="0"/>
+          <w:numId w:val="2"/>
+        </w:numPr>
+        <w:spacing w:after="80" w:line="280"/>
+      </w:pPr>
+      <w:r>
+        <w:t xml:space="preserve">El 93 % de las clientas recomendaría la tienda.</w:t>
+      </w:r>
+    </w:p>
+    <w:p>
+      <w:pPr>
+        <w:pStyle w:val="ListParagraph"/>
+        <w:numPr>
+          <w:ilvl w:val="0"/>
+          <w:numId w:val="2"/>
+        </w:numPr>
+        <w:spacing w:after="80" w:line="280"/>
+      </w:pPr>
+      <w:r>
+        <w:t xml:space="preserve">Equipo motivado y buenos proveedores.</w:t>
       </w:r>
     </w:p>
     <w:p>
@@ -110,10 +254,59 @@
           <w:b/>
           <w:bCs/>
         </w:rPr>
-        <w:t xml:space="preserve">5. Problemas: </w:t>
-      </w:r>
-      <w:r>
-        <w:t xml:space="preserve">poco alcance en redes, no está en Google Maps, todo se lleva a mano (sin POS ni inventario).</w:t>
+        <w:t xml:space="preserve">5. Situaciones problemáticas</w:t>
+      </w:r>
+    </w:p>
+    <w:p>
+      <w:pPr>
+        <w:pStyle w:val="ListParagraph"/>
+        <w:numPr>
+          <w:ilvl w:val="0"/>
+          <w:numId w:val="2"/>
+        </w:numPr>
+        <w:spacing w:after="80" w:line="280"/>
+      </w:pPr>
+      <w:r>
+        <w:t xml:space="preserve">Poco alcance en redes sociales y no aparece en Google Maps.</w:t>
+      </w:r>
+    </w:p>
+    <w:p>
+      <w:pPr>
+        <w:pStyle w:val="ListParagraph"/>
+        <w:numPr>
+          <w:ilvl w:val="0"/>
+          <w:numId w:val="2"/>
+        </w:numPr>
+        <w:spacing w:after="80" w:line="280"/>
+      </w:pPr>
+      <w:r>
+        <w:t xml:space="preserve">Todo se lleva a mano: no hay sistema POS, facturación ni inventario digital.</w:t>
+      </w:r>
+    </w:p>
+    <w:p>
+      <w:pPr>
+        <w:pStyle w:val="ListParagraph"/>
+        <w:numPr>
+          <w:ilvl w:val="0"/>
+          <w:numId w:val="2"/>
+        </w:numPr>
+        <w:spacing w:after="80" w:line="280"/>
+      </w:pPr>
+      <w:r>
+        <w:t xml:space="preserve">Hay prendas que se quedan quietas por mucho tiempo.</w:t>
+      </w:r>
+    </w:p>
+    <w:p>
+      <w:pPr>
+        <w:pStyle w:val="ListParagraph"/>
+        <w:numPr>
+          <w:ilvl w:val="0"/>
+          <w:numId w:val="2"/>
+        </w:numPr>
+        <w:spacing w:after="80" w:line="280"/>
+      </w:pPr>
+      <w:r>
+        <w:t xml:space="preserve">El equipo no conoce los valores ni el organigrama de la empresa.</w:t>
       </w:r>
     </w:p>
     <w:p>
@@ -126,10 +319,59 @@
           <w:b/>
           <w:bCs/>
         </w:rPr>
-        <w:t xml:space="preserve">6. Oportunidades: </w:t>
-      </w:r>
-      <w:r>
-        <w:t xml:space="preserve">portafolio digital, Google Maps, promociones (Jueves de Luna) y fotos y videos con IA.</w:t>
+        <w:t xml:space="preserve">6. Oportunidades de mejora</w:t>
+      </w:r>
+    </w:p>
+    <w:p>
+      <w:pPr>
+        <w:pStyle w:val="ListParagraph"/>
+        <w:numPr>
+          <w:ilvl w:val="0"/>
+          <w:numId w:val="2"/>
+        </w:numPr>
+        <w:spacing w:after="80" w:line="280"/>
+      </w:pPr>
+      <w:r>
+        <w:t xml:space="preserve">Portafolio digital con el catálogo de productos y precios.</w:t>
+      </w:r>
+    </w:p>
+    <w:p>
+      <w:pPr>
+        <w:pStyle w:val="ListParagraph"/>
+        <w:numPr>
+          <w:ilvl w:val="0"/>
+          <w:numId w:val="2"/>
+        </w:numPr>
+        <w:spacing w:after="80" w:line="280"/>
+      </w:pPr>
+      <w:r>
+        <w:t xml:space="preserve">Perfil de Google Maps y catálogo de WhatsApp Business.</w:t>
+      </w:r>
+    </w:p>
+    <w:p>
+      <w:pPr>
+        <w:pStyle w:val="ListParagraph"/>
+        <w:numPr>
+          <w:ilvl w:val="0"/>
+          <w:numId w:val="2"/>
+        </w:numPr>
+        <w:spacing w:after="80" w:line="280"/>
+      </w:pPr>
+      <w:r>
+        <w:t xml:space="preserve">Promociones creativas: "Jueves de Luna" y "Ven con tu amiga".</w:t>
+      </w:r>
+    </w:p>
+    <w:p>
+      <w:pPr>
+        <w:pStyle w:val="ListParagraph"/>
+        <w:numPr>
+          <w:ilvl w:val="0"/>
+          <w:numId w:val="2"/>
+        </w:numPr>
+        <w:spacing w:after="80" w:line="280"/>
+      </w:pPr>
+      <w:r>
+        <w:t xml:space="preserve">Fotos y videos publicitarios con inteligencia artificial.</w:t>
       </w:r>
     </w:p>
     <w:p>
@@ -149,7 +391,7 @@
       <w:r>
         <w:drawing>
           <wp:inline distT="0" distB="0" distL="0" distR="0">
-            <wp:extent cx="5334000" cy="3000375"/>
+            <wp:extent cx="5715000" cy="3219450"/>
             <wp:effectExtent t="0" r="0" b="0" l="0"/>
             <wp:docPr id="1" name="" descr="" title=""/>
             <wp:cNvGraphicFramePr>
@@ -174,7 +416,7 @@
                   <pic:spPr bwMode="auto">
                     <a:xfrm>
                       <a:off x="0" y="0"/>
-                      <a:ext cx="5334000" cy="3000375"/>
+                      <a:ext cx="5715000" cy="3219450"/>
                     </a:xfrm>
                     <a:prstGeom prst="rect">
                       <a:avLst/>
@@ -193,7 +435,7 @@
         <w:jc w:val="both"/>
       </w:pPr>
       <w:r>
-        <w:t xml:space="preserve">Efecto: ventas por debajo de su potencial. Escribe 2 causas por espina (no hace falta copiar las 3).</w:t>
+        <w:t xml:space="preserve">Efecto (cabeza del pescado): ventas por debajo de su potencial. Arriba: comunicación, procesos y medición. Abajo: producto, personas y entorno. Escribe 2 o 3 causas por espina.</w:t>
       </w:r>
     </w:p>
     <w:p>
@@ -207,11 +449,36 @@
     </w:p>
     <w:p>
       <w:pPr>
+        <w:shd w:fill="FFF4D6" w:color="auto" w:val="clear"/>
+        <w:spacing w:after="120"/>
+      </w:pPr>
+      <w:r>
+        <w:rPr>
+          <w:i/>
+          <w:iCs/>
+          <w:color w:val="7A5A00"/>
+          <w:sz w:val="20"/>
+          <w:szCs w:val="20"/>
+        </w:rPr>
+        <w:t xml:space="preserve">Escríbela con tus palabras.</w:t>
+      </w:r>
+    </w:p>
+    <w:p>
+      <w:pPr>
         <w:spacing w:after="120" w:line="300"/>
         <w:jc w:val="both"/>
       </w:pPr>
       <w:r>
-        <w:t xml:space="preserve">Aprendí que un buen producto no basta: hay que darse a conocer y medir los resultados. Con creatividad y herramientas gratis, Luna de Cristal puede crecer.</w:t>
+        <w:t xml:space="preserve">Al investigar Luna de Cristal entendí que un buen producto no es suficiente para vender. La tienda tiene clientas fieles y buenos precios, pero muchas personas en Yopal todavía no la conocen, y como todo se maneja a mano, es difícil saber qué funciona.</w:t>
+      </w:r>
+    </w:p>
+    <w:p>
+      <w:pPr>
+        <w:spacing w:after="120" w:line="300"/>
+        <w:jc w:val="both"/>
+      </w:pPr>
+      <w:r>
+        <w:t xml:space="preserve">Aprendí que innovar no siempre cuesta mucho: con creatividad y herramientas gratuitas, como Google Maps, WhatsApp Business y la inteligencia artificial, la empresa puede llegar a más clientas y crecer.</w:t>
       </w:r>
     </w:p>
     <w:sectPr>
@@ -428,6 +695,12 @@
       <w:startOverride w:val="1"/>
     </w:lvlOverride>
   </w:num>
+  <w:num w:numId="2">
+    <w:abstractNumId w:val="2"/>
+    <w:lvlOverride w:ilvl="0">
+      <w:startOverride w:val="1"/>
+    </w:lvlOverride>
+  </w:num>
 </w:numbering>
 </file>
 

</xml_diff>

<commit_message>
Corregir quién es el dueño y quién atiende en el cuaderno
Co-Authored-By: Claude Opus 5.5 <noreply@anthropic.com>
Claude-Session: https://claude.ai/code/session_01P9bj8o7UcwbCu86Zsog7Lb
</commit_message>
<xml_diff>
--- a/Actividad Alva instructora Luna de Cristal/1_CUADERNO_Lo_que_va_a_mano.docx
+++ b/Actividad Alva instructora Luna de Cristal/1_CUADERNO_Lo_que_va_a_mano.docx
@@ -85,7 +85,20 @@
         <w:spacing w:after="80" w:line="280"/>
       </w:pPr>
       <w:r>
-        <w:t xml:space="preserve">Trabajan 2 personas: la propietaria y un asesor. Atiende unas 7 clientas al día.</w:t>
+        <w:t xml:space="preserve">El dueño soy yo (está a mi nombre). Atienden mi mamá, que la administra, y una prima.</w:t>
+      </w:r>
+    </w:p>
+    <w:p>
+      <w:pPr>
+        <w:pStyle w:val="ListParagraph"/>
+        <w:numPr>
+          <w:ilvl w:val="0"/>
+          <w:numId w:val="2"/>
+        </w:numPr>
+        <w:spacing w:after="80" w:line="280"/>
+      </w:pPr>
+      <w:r>
+        <w:t xml:space="preserve">Atiende unas 7 clientas al día.</w:t>
       </w:r>
     </w:p>
     <w:p>

</xml_diff>